<commit_message>
Refresh Submission_Package copy of the simulation methods report
Co-Authored-By: Claude Sonnet 5.5 <noreply@anthropic.com>
</commit_message>
<xml_diff>
--- a/Submission_Package/1_Reports/Simulation_Methods_and_Spectra_NAM_LPS_LTA.docx
+++ b/Submission_Package/1_Reports/Simulation_Methods_and_Spectra_NAM_LPS_LTA.docx
@@ -29,7 +29,7 @@
           <w:i w:val="0"/>
           <w:sz w:val="18"/>
         </w:rPr>
-        <w:t>SERS Sepsis project, bulk-powder Raman spectral library. Version 1.1, 28 October 2026. Source files: C:\Users\sukes\Downloads\mtp (inventory in Section 10).</w:t>
+        <w:t>SERS Sepsis project, bulk-powder Raman spectral library. Version 1.2, 28 October 2026. Source files: C:\Users\sukes\Downloads\mtp (inventory in Section 10).</w:t>
       </w:r>
     </w:p>
     <w:p>
@@ -39,7 +39,7 @@
           <w:i w:val="0"/>
           <w:sz w:val="20"/>
         </w:rPr>
-        <w:t>This document records the simulation work only; the comparison with the measured spectra is in a separate document. NAM was calculated as a whole molecule. For LPS there are two calculations: five separate fragments, and a model of the Kdo2-lipid A backbone with shortened acyl chains (201 atoms, run 27-28 Oct 2026). LTA was simulated as three separate fragments. The intact LPS and LTA molecules are too large and variable to calculate (Section 7), so no whole-LPS or whole-LTA spectrum was simulated. Settings that are not written in the available files are given as Not recorded.</w:t>
+        <w:t>This document records the simulation work only; the comparison with the measured spectra is in a separate document. NAM was calculated as a whole molecule. For LPS there are two calculations: five separate fragments, and a model of the Kdo2-lipid A backbone with shortened acyl chains (201 atoms, run 27-28 Oct 2026). LTA was simulated as three separate fragments and, on 28 Oct 2026, as a 93-atom whole-molecule model of three glycerol-phosphate units carrying two D-alanine esters and one alpha-GlcNAc. The intact LPS and LTA molecules are too large and variable to calculate (Section 7), so no spectrum of the intact LPS or LTA was simulated. Settings that are not written in the available files are given as Not recorded.</w:t>
       </w:r>
     </w:p>
     <w:p/>
@@ -172,12 +172,8 @@
             <w:tcW w:type="dxa" w:w="2948"/>
           </w:tcPr>
           <w:p>
-            <w:r/>
-            <w:r>
-              <w:rPr>
-                <w:sz w:val="17"/>
-              </w:rPr>
-              <w:t>Three separate fragments: glycerol-phosphate (2 units), D-alanine, N-acetyl-D-glucosamine</w:t>
+            <w:r>
+              <w:t>Three separate fragments: glycerol-phosphate (2 units), D-alanine, N-acetyl-D-glucosamine Also: one whole-molecule model (3 glycerol-phosphate units, 2 D-Ala esters, 1 alpha-GlcNAc).</w:t>
             </w:r>
           </w:p>
         </w:tc>
@@ -226,12 +222,8 @@
             <w:tcW w:type="dxa" w:w="2948"/>
           </w:tcPr>
           <w:p>
-            <w:r/>
-            <w:r>
-              <w:rPr>
-                <w:sz w:val="17"/>
-              </w:rPr>
-              <w:t>35 for glycerol-phosphate; others Not recorded</w:t>
+            <w:r>
+              <w:t>35 for glycerol-phosphate; others Not recorded. Whole-molecule model: 93 (C23H45N3O20P2, net charge 0)</w:t>
             </w:r>
           </w:p>
         </w:tc>
@@ -281,12 +273,8 @@
             <w:tcW w:type="dxa" w:w="2948"/>
           </w:tcPr>
           <w:p>
-            <w:r/>
-            <w:r>
-              <w:rPr>
-                <w:sz w:val="17"/>
-              </w:rPr>
-              <w:t>Gaussian 16 Rev C.01 (log read for glycerol-phosphate)</w:t>
+            <w:r>
+              <w:t>Gaussian 16 Rev C.01 (log read for glycerol-phosphate). Whole-molecule model: Gaussian 16W Rev C.01</w:t>
             </w:r>
           </w:p>
         </w:tc>
@@ -335,12 +323,8 @@
             <w:tcW w:type="dxa" w:w="2948"/>
           </w:tcPr>
           <w:p>
-            <w:r/>
-            <w:r>
-              <w:rPr>
-                <w:sz w:val="17"/>
-              </w:rPr>
-              <w:t>B3LYP / 6-31G(d)</w:t>
+            <w:r>
+              <w:t>B3LYP / 6-31G(d). Whole-molecule model: PM6 pre-optimisation, then B3LYP / 3-21G</w:t>
             </w:r>
           </w:p>
         </w:tc>
@@ -389,12 +373,8 @@
             <w:tcW w:type="dxa" w:w="2948"/>
           </w:tcPr>
           <w:p>
-            <w:r/>
-            <w:r>
-              <w:rPr>
-                <w:sz w:val="17"/>
-              </w:rPr>
-              <w:t>Implicit water (SMD)</w:t>
+            <w:r>
+              <w:t>Implicit water (SMD). Whole-molecule model: gas phase, no counter-ions</w:t>
             </w:r>
           </w:p>
         </w:tc>
@@ -443,12 +423,8 @@
             <w:tcW w:type="dxa" w:w="2948"/>
           </w:tcPr>
           <w:p>
-            <w:r/>
-            <w:r>
-              <w:rPr>
-                <w:sz w:val="17"/>
-              </w:rPr>
-              <w:t>0.96 (0.96 to 0.97 evaluated)</w:t>
+            <w:r>
+              <w:t>0.96 (0.96 to 0.97 evaluated). Whole-molecule model: 0.965 (not fitted for 3-21G)</w:t>
             </w:r>
           </w:p>
         </w:tc>
@@ -497,12 +473,8 @@
             <w:tcW w:type="dxa" w:w="2948"/>
           </w:tcPr>
           <w:p>
-            <w:r/>
-            <w:r>
-              <w:rPr>
-                <w:sz w:val="17"/>
-              </w:rPr>
-              <w:t>None (glycerol-phosphate log); others Not found</w:t>
+            <w:r>
+              <w:t>None (glycerol-phosphate log); others Not found. Whole-molecule model: none (273 modes; true minimum)</w:t>
             </w:r>
           </w:p>
         </w:tc>
@@ -551,12 +523,8 @@
             <w:tcW w:type="dxa" w:w="2948"/>
           </w:tcPr>
           <w:p>
-            <w:r/>
-            <w:r>
-              <w:rPr>
-                <w:sz w:val="17"/>
-              </w:rPr>
-              <w:t>Broadened curves for 3 fragments; 99 modes for glycerol-phosphate</w:t>
+            <w:r>
+              <w:t>Broadened curves for 3 fragments; 99 modes for glycerol-phosphate. Whole-molecule model: 273 modes (165 in 400-1800 cm-1), broadened 785 nm spectrum 200-3300 cm-1</w:t>
             </w:r>
           </w:p>
         </w:tc>
@@ -605,12 +573,8 @@
             <w:tcW w:type="dxa" w:w="2948"/>
           </w:tcPr>
           <w:p>
-            <w:r/>
-            <w:r>
-              <w:rPr>
-                <w:sz w:val="17"/>
-              </w:rPr>
-              <w:t>Intact LTA a variable polymer</w:t>
+            <w:r>
+              <w:t>Intact LTA a variable polymer. Whole-molecule model: a short piece of the polymer that carries all three substituent types</w:t>
             </w:r>
           </w:p>
         </w:tc>
@@ -4156,7 +4120,7 @@
         <w:pStyle w:val="Heading1"/>
       </w:pPr>
       <w:r>
-        <w:t>6. LTA: three-fragment simulation</w:t>
+        <w:t>6. LTA: three-fragment simulation and whole-molecule model</w:t>
       </w:r>
     </w:p>
     <w:p>
@@ -4736,7 +4700,639 @@
           <w:b w:val="0"/>
           <w:i w:val="0"/>
         </w:rPr>
-        <w:t>The three curves were averaged with equal weights and also fitted by NNLS to a measured LTA spectrum. The fitted weights were glycerol-phosphate 20.1 %, D-alanine 39.5 % and N-acetyl-D-glucosamine 40.4 %, with RMSE 0.193, MAE 0.136, R-squared -0.294 and Pearson r 0.345 (LTA_complete_results.xlsx). These numbers are the earlier fit to April data and are reported here as found.</w:t>
+        <w:t>The three curves were averaged with equal weights and also fitted by NNLS to a measured LTA spectrum. The fitted weights were glycerol-phosphate 20.1 %, D-alanine 39.5 % and N-acetyl-D-glucosamine 40.4 %, with RMSE 0.193, MAE 0.136, R-squared -0.294 and Pearson r 0.345 (LTA_complete_results.xlsx). These numbers are the earlier fit to April data and are reported here as found; the comparison document now tests the fragments against the v2.1 reference.</w:t>
+      </w:r>
+    </w:p>
+    <w:p>
+      <w:pPr>
+        <w:pStyle w:val="Heading2"/>
+      </w:pPr>
+      <w:r>
+        <w:t>6.5 Whole-molecule model: three glycerol-phosphate units with D-alanine and GlcNAc</w:t>
+      </w:r>
+    </w:p>
+    <w:p>
+      <w:r>
+        <w:rPr>
+          <w:i w:val="0"/>
+        </w:rPr>
+        <w:t>Why. The earlier fragment sum ignores the bonds that join the pieces, so a model that keeps them was built. There is no PubChem entry for LTA (a polymer), so the structure was built with RDKit 2026.03.3, not downloaded. S. aureus LTA is about 23 glycerol-phosphate repeats on a Glc2-diacylglycerol anchor; position 2 of each glycerol can be free, esterified with D-alanine or carry N-acetylglucosamine. The model carries all three in a three-unit chain.</w:t>
+      </w:r>
+    </w:p>
+    <w:tbl>
+      <w:tblPr>
+        <w:tblStyle w:val="TableGrid"/>
+        <w:tblW w:type="auto" w:w="0"/>
+        <w:tblLook w:firstColumn="1" w:firstRow="1" w:lastColumn="0" w:lastRow="0" w:noHBand="0" w:noVBand="1" w:val="04A0"/>
+      </w:tblPr>
+      <w:tblGrid>
+        <w:gridCol w:w="5159"/>
+        <w:gridCol w:w="5159"/>
+      </w:tblGrid>
+      <w:tr>
+        <w:tc>
+          <w:tcPr>
+            <w:tcW w:type="dxa" w:w="2268"/>
+            <w:shd w:val="clear" w:color="auto" w:fill="D9D9D9"/>
+          </w:tcPr>
+          <w:p>
+            <w:r/>
+            <w:r>
+              <w:rPr>
+                <w:b/>
+                <w:sz w:val="16"/>
+              </w:rPr>
+              <w:t>Item</w:t>
+            </w:r>
+          </w:p>
+        </w:tc>
+        <w:tc>
+          <w:tcPr>
+            <w:tcW w:type="dxa" w:w="7370"/>
+            <w:shd w:val="clear" w:color="auto" w:fill="D9D9D9"/>
+          </w:tcPr>
+          <w:p>
+            <w:r/>
+            <w:r>
+              <w:rPr>
+                <w:b/>
+                <w:sz w:val="16"/>
+              </w:rPr>
+              <w:t>Value</w:t>
+            </w:r>
+          </w:p>
+        </w:tc>
+      </w:tr>
+      <w:tr>
+        <w:tc>
+          <w:tcPr>
+            <w:tcW w:type="dxa" w:w="2268"/>
+          </w:tcPr>
+          <w:p>
+            <w:r/>
+            <w:r>
+              <w:rPr>
+                <w:sz w:val="16"/>
+              </w:rPr>
+              <w:t>Composition</w:t>
+            </w:r>
+          </w:p>
+        </w:tc>
+        <w:tc>
+          <w:tcPr>
+            <w:tcW w:type="dxa" w:w="7370"/>
+          </w:tcPr>
+          <w:p>
+            <w:r/>
+            <w:r>
+              <w:rPr>
+                <w:sz w:val="16"/>
+              </w:rPr>
+              <w:t>Three glycerol-phosphate units joined by two phosphodiester links; D-alanine ester on each of the two outer glycerols; alpha-GlcNAc on the central glycerol</w:t>
+            </w:r>
+          </w:p>
+        </w:tc>
+      </w:tr>
+      <w:tr>
+        <w:tc>
+          <w:tcPr>
+            <w:tcW w:type="dxa" w:w="2268"/>
+          </w:tcPr>
+          <w:p>
+            <w:r/>
+            <w:r>
+              <w:rPr>
+                <w:sz w:val="16"/>
+              </w:rPr>
+              <w:t>Formula, atoms, charge</w:t>
+            </w:r>
+          </w:p>
+        </w:tc>
+        <w:tc>
+          <w:tcPr>
+            <w:tcW w:type="dxa" w:w="7370"/>
+          </w:tcPr>
+          <w:p>
+            <w:r/>
+            <w:r>
+              <w:rPr>
+                <w:sz w:val="16"/>
+              </w:rPr>
+              <w:t>C23H45N3O20P2; 93 atoms; net charge 0, singlet (two phosphodiesters -1, two alanine ammonium groups +1)</w:t>
+            </w:r>
+          </w:p>
+        </w:tc>
+      </w:tr>
+      <w:tr>
+        <w:tc>
+          <w:tcPr>
+            <w:tcW w:type="dxa" w:w="2268"/>
+          </w:tcPr>
+          <w:p>
+            <w:r/>
+            <w:r>
+              <w:rPr>
+                <w:sz w:val="16"/>
+              </w:rPr>
+              <w:t>Stereochemistry</w:t>
+            </w:r>
+          </w:p>
+        </w:tc>
+        <w:tc>
+          <w:tcPr>
+            <w:tcW w:type="dxa" w:w="7370"/>
+          </w:tcPr>
+          <w:p>
+            <w:r/>
+            <w:r>
+              <w:rPr>
+                <w:sz w:val="16"/>
+              </w:rPr>
+              <w:t>GlcNAc from LTA\N-Acetyl-D-Glucosamine.sdf (beta-anomer, R at C1) flipped to alpha (S at C1) because LTA GlcNAc is alpha-linked; D-alanine R (D) on both esters, checked with RDKit CIP labels. The two glycerol arms were set the same and not checked against the sn-glycerol-1-phosphate form</w:t>
+            </w:r>
+          </w:p>
+        </w:tc>
+      </w:tr>
+      <w:tr>
+        <w:tc>
+          <w:tcPr>
+            <w:tcW w:type="dxa" w:w="2268"/>
+          </w:tcPr>
+          <w:p>
+            <w:r/>
+            <w:r>
+              <w:rPr>
+                <w:sz w:val="16"/>
+              </w:rPr>
+              <w:t>SMILES</w:t>
+            </w:r>
+          </w:p>
+        </w:tc>
+        <w:tc>
+          <w:tcPr>
+            <w:tcW w:type="dxa" w:w="7370"/>
+          </w:tcPr>
+          <w:p>
+            <w:r/>
+            <w:r>
+              <w:rPr>
+                <w:sz w:val="16"/>
+              </w:rPr>
+              <w:t>CC(=O)N[C@@H]1[C@@H](O)[C@H](O)[C@@H](CO)O[C@@H]1O[C@H](COP(=O)([O-])OC[C@H](OC(=O)[C@@H](C)[NH3+])CO)COP(=O)([O-])OC[C@H](OC(=O)[C@@H](C)[NH3+])CO</w:t>
+            </w:r>
+          </w:p>
+        </w:tc>
+      </w:tr>
+      <w:tr>
+        <w:tc>
+          <w:tcPr>
+            <w:tcW w:type="dxa" w:w="2268"/>
+          </w:tcPr>
+          <w:p>
+            <w:r/>
+            <w:r>
+              <w:rPr>
+                <w:sz w:val="16"/>
+              </w:rPr>
+              <w:t>Starting geometry</w:t>
+            </w:r>
+          </w:p>
+        </w:tc>
+        <w:tc>
+          <w:tcPr>
+            <w:tcW w:type="dxa" w:w="7370"/>
+          </w:tcPr>
+          <w:p>
+            <w:r/>
+            <w:r>
+              <w:rPr>
+                <w:sz w:val="16"/>
+              </w:rPr>
+              <w:t>Best of 300 ETKDGv3 conformers (seed 7), each MMFF-optimised; lowest MMFF energy -311.4 kcal/mol</w:t>
+            </w:r>
+          </w:p>
+        </w:tc>
+      </w:tr>
+      <w:tr>
+        <w:tc>
+          <w:tcPr>
+            <w:tcW w:type="dxa" w:w="2268"/>
+          </w:tcPr>
+          <w:p>
+            <w:r/>
+            <w:r>
+              <w:rPr>
+                <w:sz w:val="16"/>
+              </w:rPr>
+              <w:t>Software</w:t>
+            </w:r>
+          </w:p>
+        </w:tc>
+        <w:tc>
+          <w:tcPr>
+            <w:tcW w:type="dxa" w:w="7370"/>
+          </w:tcPr>
+          <w:p>
+            <w:r/>
+            <w:r>
+              <w:rPr>
+                <w:sz w:val="16"/>
+              </w:rPr>
+              <w:t>Gaussian 16W Rev C.01 (C:\G16W\g16.exe); RDKit; Python (numpy, scipy, matplotlib)</w:t>
+            </w:r>
+          </w:p>
+        </w:tc>
+      </w:tr>
+      <w:tr>
+        <w:tc>
+          <w:tcPr>
+            <w:tcW w:type="dxa" w:w="2268"/>
+          </w:tcPr>
+          <w:p>
+            <w:r/>
+            <w:r>
+              <w:rPr>
+                <w:sz w:val="16"/>
+              </w:rPr>
+              <w:t>Job 1</w:t>
+            </w:r>
+          </w:p>
+        </w:tc>
+        <w:tc>
+          <w:tcPr>
+            <w:tcW w:type="dxa" w:w="7370"/>
+          </w:tcPr>
+          <w:p>
+            <w:r/>
+            <w:r>
+              <w:rPr>
+                <w:sz w:val="16"/>
+              </w:rPr>
+              <w:t># opt pm6, gas phase, default convergence, charge 0 (finished 09:29)</w:t>
+            </w:r>
+          </w:p>
+        </w:tc>
+      </w:tr>
+      <w:tr>
+        <w:tc>
+          <w:tcPr>
+            <w:tcW w:type="dxa" w:w="2268"/>
+          </w:tcPr>
+          <w:p>
+            <w:r/>
+            <w:r>
+              <w:rPr>
+                <w:sz w:val="16"/>
+              </w:rPr>
+              <w:t>Job 2</w:t>
+            </w:r>
+          </w:p>
+        </w:tc>
+        <w:tc>
+          <w:tcPr>
+            <w:tcW w:type="dxa" w:w="7370"/>
+          </w:tcPr>
+          <w:p>
+            <w:r/>
+            <w:r>
+              <w:rPr>
+                <w:sz w:val="16"/>
+              </w:rPr>
+              <w:t># opt freq=raman b3lyp/3-21g geom=allcheck guess=read, gas phase; optimisation converged at step 75 (12:16); frequencies 49 min; normal termination 13:05</w:t>
+            </w:r>
+          </w:p>
+        </w:tc>
+      </w:tr>
+      <w:tr>
+        <w:tc>
+          <w:tcPr>
+            <w:tcW w:type="dxa" w:w="2268"/>
+          </w:tcPr>
+          <w:p>
+            <w:r/>
+            <w:r>
+              <w:rPr>
+                <w:sz w:val="16"/>
+              </w:rPr>
+              <w:t>Resources</w:t>
+            </w:r>
+          </w:p>
+        </w:tc>
+        <w:tc>
+          <w:tcPr>
+            <w:tcW w:type="dxa" w:w="7370"/>
+          </w:tcPr>
+          <w:p>
+            <w:r/>
+            <w:r>
+              <w:rPr>
+                <w:sz w:val="16"/>
+              </w:rPr>
+              <w:t>%nprocshared=28, %mem=54GB (i7-14700 PC); job queued after the lipid A job</w:t>
+            </w:r>
+          </w:p>
+        </w:tc>
+      </w:tr>
+    </w:tbl>
+    <w:p/>
+    <w:p>
+      <w:pPr>
+        <w:pStyle w:val="Heading2"/>
+      </w:pPr>
+      <w:r>
+        <w:t>6.6 Processing of the LTA model calculation</w:t>
+      </w:r>
+    </w:p>
+    <w:tbl>
+      <w:tblPr>
+        <w:tblStyle w:val="TableGrid"/>
+        <w:tblW w:type="auto" w:w="0"/>
+        <w:tblLook w:firstColumn="1" w:firstRow="1" w:lastColumn="0" w:lastRow="0" w:noHBand="0" w:noVBand="1" w:val="04A0"/>
+      </w:tblPr>
+      <w:tblGrid>
+        <w:gridCol w:w="5159"/>
+        <w:gridCol w:w="5159"/>
+      </w:tblGrid>
+      <w:tr>
+        <w:tc>
+          <w:tcPr>
+            <w:tcW w:type="dxa" w:w="2268"/>
+            <w:shd w:val="clear" w:color="auto" w:fill="D9D9D9"/>
+          </w:tcPr>
+          <w:p>
+            <w:r/>
+            <w:r>
+              <w:rPr>
+                <w:b/>
+                <w:sz w:val="16"/>
+              </w:rPr>
+              <w:t>Step</w:t>
+            </w:r>
+          </w:p>
+        </w:tc>
+        <w:tc>
+          <w:tcPr>
+            <w:tcW w:type="dxa" w:w="7370"/>
+            <w:shd w:val="clear" w:color="auto" w:fill="D9D9D9"/>
+          </w:tcPr>
+          <w:p>
+            <w:r/>
+            <w:r>
+              <w:rPr>
+                <w:b/>
+                <w:sz w:val="16"/>
+              </w:rPr>
+              <w:t>Detail</w:t>
+            </w:r>
+          </w:p>
+        </w:tc>
+      </w:tr>
+      <w:tr>
+        <w:tc>
+          <w:tcPr>
+            <w:tcW w:type="dxa" w:w="2268"/>
+          </w:tcPr>
+          <w:p>
+            <w:r/>
+            <w:r>
+              <w:rPr>
+                <w:sz w:val="16"/>
+              </w:rPr>
+              <w:t>Extraction</w:t>
+            </w:r>
+          </w:p>
+        </w:tc>
+        <w:tc>
+          <w:tcPr>
+            <w:tcW w:type="dxa" w:w="7370"/>
+          </w:tcPr>
+          <w:p>
+            <w:r/>
+            <w:r>
+              <w:rPr>
+                <w:sz w:val="16"/>
+              </w:rPr>
+              <w:t>Harmonic frequencies and Raman activities from lta_model.out into lta_model_raman_act.csv (273 modes, unscaled; lowest 31 cm-1, none imaginary)</w:t>
+            </w:r>
+          </w:p>
+        </w:tc>
+      </w:tr>
+      <w:tr>
+        <w:tc>
+          <w:tcPr>
+            <w:tcW w:type="dxa" w:w="2268"/>
+          </w:tcPr>
+          <w:p>
+            <w:r/>
+            <w:r>
+              <w:rPr>
+                <w:sz w:val="16"/>
+              </w:rPr>
+              <w:t>Scaling</w:t>
+            </w:r>
+          </w:p>
+        </w:tc>
+        <w:tc>
+          <w:tcPr>
+            <w:tcW w:type="dxa" w:w="7370"/>
+          </w:tcPr>
+          <w:p>
+            <w:r/>
+            <w:r>
+              <w:rPr>
+                <w:sz w:val="16"/>
+              </w:rPr>
+              <w:t>Frequencies x 0.965 (typical B3LYP value; not fitted or benchmarked for 3-21G)</w:t>
+            </w:r>
+          </w:p>
+        </w:tc>
+      </w:tr>
+      <w:tr>
+        <w:tc>
+          <w:tcPr>
+            <w:tcW w:type="dxa" w:w="2268"/>
+          </w:tcPr>
+          <w:p>
+            <w:r/>
+            <w:r>
+              <w:rPr>
+                <w:sz w:val="16"/>
+              </w:rPr>
+              <w:t>Intensity</w:t>
+            </w:r>
+          </w:p>
+        </w:tc>
+        <w:tc>
+          <w:tcPr>
+            <w:tcW w:type="dxa" w:w="7370"/>
+          </w:tcPr>
+          <w:p>
+            <w:r/>
+            <w:r>
+              <w:rPr>
+                <w:sz w:val="16"/>
+              </w:rPr>
+              <w:t>I = S (v0 - v)^4 / [v (1 - exp(-hcv/kT))], v0 = 1e7/785 cm-1, T = 298.15 K</w:t>
+            </w:r>
+          </w:p>
+        </w:tc>
+      </w:tr>
+      <w:tr>
+        <w:tc>
+          <w:tcPr>
+            <w:tcW w:type="dxa" w:w="2268"/>
+          </w:tcPr>
+          <w:p>
+            <w:r/>
+            <w:r>
+              <w:rPr>
+                <w:sz w:val="16"/>
+              </w:rPr>
+              <w:t>Broadening</w:t>
+            </w:r>
+          </w:p>
+        </w:tc>
+        <w:tc>
+          <w:tcPr>
+            <w:tcW w:type="dxa" w:w="7370"/>
+          </w:tcPr>
+          <w:p>
+            <w:r/>
+            <w:r>
+              <w:rPr>
+                <w:sz w:val="16"/>
+              </w:rPr>
+              <w:t>Lorentzian, FWHM 12 cm-1; 200-3300 cm-1; 6200 points; normalised to the tallest peak (make_spectrum.py)</w:t>
+            </w:r>
+          </w:p>
+        </w:tc>
+      </w:tr>
+      <w:tr>
+        <w:tc>
+          <w:tcPr>
+            <w:tcW w:type="dxa" w:w="2268"/>
+          </w:tcPr>
+          <w:p>
+            <w:r/>
+            <w:r>
+              <w:rPr>
+                <w:sz w:val="16"/>
+              </w:rPr>
+              <w:t>Comparison grid</w:t>
+            </w:r>
+          </w:p>
+        </w:tc>
+        <w:tc>
+          <w:tcPr>
+            <w:tcW w:type="dxa" w:w="7370"/>
+          </w:tcPr>
+          <w:p>
+            <w:r/>
+            <w:r>
+              <w:rPr>
+                <w:sz w:val="16"/>
+              </w:rPr>
+              <w:t>For the comparison document the 165 modes in 400-1800 cm-1 were drawn as Gaussians of FWHM 12 cm-1 on a 1 cm-1 grid (lta_model_compare.py)</w:t>
+            </w:r>
+          </w:p>
+        </w:tc>
+      </w:tr>
+    </w:tbl>
+    <w:p/>
+    <w:p>
+      <w:pPr>
+        <w:pStyle w:val="Heading2"/>
+      </w:pPr>
+      <w:r>
+        <w:t>6.7 Spectrum obtained and its limits</w:t>
+      </w:r>
+    </w:p>
+    <w:p>
+      <w:r>
+        <w:rPr>
+          <w:i w:val="0"/>
+        </w:rPr>
+        <w:t>Strongest scaled features in the fingerprint region (relative height): 689 (1.00), 1490 (0.80) and 1503 (0.66) in the broadened spectrum, then 816, 654, 1325, 1240, 914, 972 and 1006 (0.29 to 0.34). The 1490-1503 group is probably the NH3+ / amide region and 689 probably a phosphate P-O-C or ring deformation; these assignments were not verified against the vibrational displacements.</w:t>
+      </w:r>
+    </w:p>
+    <w:p>
+      <w:pPr>
+        <w:jc w:val="center"/>
+      </w:pPr>
+      <w:r>
+        <w:drawing>
+          <wp:inline xmlns:a="http://schemas.openxmlformats.org/drawingml/2006/main" xmlns:pic="http://schemas.openxmlformats.org/drawingml/2006/picture">
+            <wp:extent cx="6120000" cy="4284000"/>
+            <wp:docPr id="6" name="Picture 6"/>
+            <wp:cNvGraphicFramePr>
+              <a:graphicFrameLocks noChangeAspect="1"/>
+            </wp:cNvGraphicFramePr>
+            <a:graphic>
+              <a:graphicData uri="http://schemas.openxmlformats.org/drawingml/2006/picture">
+                <pic:pic>
+                  <pic:nvPicPr>
+                    <pic:cNvPr id="0" name="lta_model_spectrum_785nm.png"/>
+                    <pic:cNvPicPr/>
+                  </pic:nvPicPr>
+                  <pic:blipFill>
+                    <a:blip r:embed="rId14"/>
+                    <a:stretch>
+                      <a:fillRect/>
+                    </a:stretch>
+                  </pic:blipFill>
+                  <pic:spPr>
+                    <a:xfrm>
+                      <a:off x="0" y="0"/>
+                      <a:ext cx="6120000" cy="4284000"/>
+                    </a:xfrm>
+                    <a:prstGeom prst="rect"/>
+                  </pic:spPr>
+                </pic:pic>
+              </a:graphicData>
+            </a:graphic>
+          </wp:inline>
+        </w:drawing>
+      </w:r>
+    </w:p>
+    <w:p>
+      <w:r>
+        <w:rPr>
+          <w:i/>
+          <w:sz w:val="17"/>
+        </w:rPr>
+        <w:t>Figure 6. Whole-molecule LTA model: calculated Raman spectrum at 785 nm (B3LYP/3-21G, scaled 0.965, FWHM 12 cm-1), from the calculation folder.</w:t>
+      </w:r>
+    </w:p>
+    <w:p>
+      <w:pPr>
+        <w:pStyle w:val="ListBullet"/>
+      </w:pPr>
+      <w:r>
+        <w:t>Quick level: gas phase and a small basis set; positions are approximate and intensities distorted, especially for the charged phosphate and ammonium groups.</w:t>
+      </w:r>
+    </w:p>
+    <w:p>
+      <w:pPr>
+        <w:pStyle w:val="ListBullet"/>
+      </w:pPr>
+      <w:r>
+        <w:t>Peaks near 2410, 2510 and 2700-2800 cm-1 are probably artefacts of strong NH3+...phosphate hydrogen bonds without water; ignore that region.</w:t>
+      </w:r>
+    </w:p>
+    <w:p>
+      <w:pPr>
+        <w:pStyle w:val="ListBullet"/>
+      </w:pPr>
+      <w:r>
+        <w:t>Short chain (three units, no glycolipid anchor): chain-end effects exaggerated, repeat-unit bands under-represented. No counter-ions, no water, one conformer. Glycerol stereochemistry assumed.</w:t>
+      </w:r>
+    </w:p>
+    <w:p>
+      <w:pPr>
+        <w:pStyle w:val="ListBullet"/>
+      </w:pPr>
+      <w:r>
+        <w:t>A higher-level run (B3LYP/6-31+G(d,p), water PCM, same level as NAM) was started from this geometry on 28 Oct 2026 and is not finished; its results are not in this document.</w:t>
       </w:r>
     </w:p>
     <w:p>
@@ -4753,7 +5349,7 @@
           <w:b w:val="0"/>
           <w:i w:val="0"/>
         </w:rPr>
-        <w:t>The reasons below come from the project files; general points are marked as such. For LPS, the shortened Kdo2-lipid A model of Section 5.5 is the largest whole-molecule calculation that was feasible; for LTA only fragments were run.</w:t>
+        <w:t>The reasons below come from the project files; general points are marked as such. For LPS, the shortened Kdo2-lipid A model of Section 5.5 is the largest whole-molecule calculation that was feasible; for LTA the three-unit model of Section 6.5 is the largest run so far.</w:t>
       </w:r>
     </w:p>
     <w:tbl>
@@ -5185,7 +5781,7 @@
         <w:pStyle w:val="ListBullet"/>
       </w:pPr>
       <w:r>
-        <w:t>Rerun the lipid A model at B3LYP/6-31G(d) or B3LYP/6-31+G(d,p) with water (PCM) from the optimised geometry, expect days of run time; and run a two-to-three-unit glycerol-phosphate oligomer with D-alanine ester and counter-ions for LTA, on a workstation with enough memory.</w:t>
+        <w:t>Rerun the lipid A model at B3LYP/6-31G(d) or B3LYP/6-31+G(d,p) with water (PCM) from the optimised geometry, expect days of run time; and finish the LTA model at B3LYP/6-31+G(d,p) with water (started 28 Oct), then add counter-ions, a longer chain and the glycolipid anchor.</w:t>
       </w:r>
     </w:p>
     <w:p>
@@ -5265,7 +5861,7 @@
         <w:pStyle w:val="ListBullet"/>
       </w:pPr>
       <w:r>
-        <w:t>The LTA fit in Section 6.4 was to April data, not to the new library reference.</w:t>
+        <w:t>The LTA fit in Section 6.4 was to April data; the comparison document tests the fragments and the model against the v2.1 reference. The LTA model (Section 6.7) is a quick-level, three-unit, gas-phase calculation.</w:t>
       </w:r>
     </w:p>
     <w:p>
@@ -5305,7 +5901,7 @@
         <w:pStyle w:val="ListBullet"/>
       </w:pPr>
       <w:r>
-        <w:t>For LPS or LTA fragments use the route and scale factor in Sections 5.2 and 6.2, and record charge and solvent. For the lipid A model use the two-job input in lipidA_short.gjf and make_spectrum.py (Section 5.6).</w:t>
+        <w:t>For LPS or LTA fragments use the route and scale factor in Sections 5.2 and 6.2, and record charge and solvent. For the LTA model use lta_model.gjf (two-job input) and make_spectrum.py (Section 6.6). For the lipid A model use the two-job input in lipidA_short.gjf and make_spectrum.py (Section 5.6).</w:t>
       </w:r>
     </w:p>
     <w:p>
@@ -5746,6 +6342,28 @@
           <w:p>
             <w:r>
               <w:t>C:\Users\sukes\Downloads\sukesh\lps output simulation (copy in SERS_Sepsis_Spectral_Library\08_Methodology\simulation\LPS_LipidA_Model_20261028): lipidA_short.gjf (input), lipidA_short.out (Gaussian log, 34 MB), lipidA_short.sdf, lipidA_raman_act.csv, lipidA_spectrum_785nm.csv and .png, make_spectrum.py, Lipid_A_Raman_Methods.md</w:t>
+            </w:r>
+          </w:p>
+        </w:tc>
+      </w:tr>
+      <w:tr>
+        <w:tc>
+          <w:tcPr>
+            <w:tcW w:type="dxa" w:w="3118"/>
+          </w:tcPr>
+          <w:p>
+            <w:r>
+              <w:t>LTA whole-molecule model</w:t>
+            </w:r>
+          </w:p>
+        </w:tc>
+        <w:tc>
+          <w:tcPr>
+            <w:tcW w:type="dxa" w:w="7087"/>
+          </w:tcPr>
+          <w:p>
+            <w:r>
+              <w:t>C:\Users\sukes\Downloads\sukesh\simulation\lta output simulation (copy in SERS_Sepsis_Spectral_Library\08_Methodology\simulation\LTA_Model_20261028): lta_model.gjf, .sdf, .smi, .out, lta_model_raman_act.csv, lta_model_spectrum_785nm.csv/.png, build_lta.py, make_spectrum.py, LTA_Raman_Methods.md, LTA_Raman_Full_Report.docx</w:t>
             </w:r>
           </w:p>
         </w:tc>

</xml_diff>